<commit_message>
Update Rachel's message; rebuild pamphlet and poster
Co-Authored-By: Claude Opus 5.5 <noreply@anthropic.com>
</commit_message>
<xml_diff>
--- a/source/mem map (organized).docx
+++ b/source/mem map (organized).docx
@@ -2492,12 +2492,12 @@
                 <wp:inline distB="19050" distT="19050" distL="19050" distR="19050">
                   <wp:extent cx="1333500" cy="1778000"/>
                   <wp:effectExtent b="0" l="0" r="0" t="0"/>
-                  <wp:docPr id="58" name="image56.jpg"/>
+                  <wp:docPr id="58" name="image55.jpg"/>
                   <a:graphic>
                     <a:graphicData uri="http://schemas.openxmlformats.org/drawingml/2006/picture">
                       <pic:pic>
                         <pic:nvPicPr>
-                          <pic:cNvPr id="0" name="image56.jpg"/>
+                          <pic:cNvPr id="0" name="image55.jpg"/>
                           <pic:cNvPicPr preferRelativeResize="0"/>
                         </pic:nvPicPr>
                         <pic:blipFill>
@@ -3064,12 +3064,12 @@
                 <wp:inline distB="19050" distT="19050" distL="19050" distR="19050">
                   <wp:extent cx="1333500" cy="882777"/>
                   <wp:effectExtent b="0" l="0" r="0" t="0"/>
-                  <wp:docPr id="59" name="image59.jpg"/>
+                  <wp:docPr id="59" name="image48.jpg"/>
                   <a:graphic>
                     <a:graphicData uri="http://schemas.openxmlformats.org/drawingml/2006/picture">
                       <pic:pic>
                         <pic:nvPicPr>
-                          <pic:cNvPr id="0" name="image59.jpg"/>
+                          <pic:cNvPr id="0" name="image48.jpg"/>
                           <pic:cNvPicPr preferRelativeResize="0"/>
                         </pic:nvPicPr>
                         <pic:blipFill>
@@ -5151,12 +5151,12 @@
                 <wp:inline distB="19050" distT="19050" distL="19050" distR="19050">
                   <wp:extent cx="1333500" cy="888111"/>
                   <wp:effectExtent b="0" l="0" r="0" t="0"/>
-                  <wp:docPr id="43" name="image38.jpg"/>
+                  <wp:docPr id="43" name="image44.jpg"/>
                   <a:graphic>
                     <a:graphicData uri="http://schemas.openxmlformats.org/drawingml/2006/picture">
                       <pic:pic>
                         <pic:nvPicPr>
-                          <pic:cNvPr id="0" name="image38.jpg"/>
+                          <pic:cNvPr id="0" name="image44.jpg"/>
                           <pic:cNvPicPr preferRelativeResize="0"/>
                         </pic:nvPicPr>
                         <pic:blipFill>
@@ -5422,12 +5422,12 @@
                 <wp:inline distB="19050" distT="19050" distL="19050" distR="19050">
                   <wp:extent cx="1333500" cy="1000125"/>
                   <wp:effectExtent b="0" l="0" r="0" t="0"/>
-                  <wp:docPr id="44" name="image35.jpg"/>
+                  <wp:docPr id="44" name="image31.jpg"/>
                   <a:graphic>
                     <a:graphicData uri="http://schemas.openxmlformats.org/drawingml/2006/picture">
                       <pic:pic>
                         <pic:nvPicPr>
-                          <pic:cNvPr id="0" name="image35.jpg"/>
+                          <pic:cNvPr id="0" name="image31.jpg"/>
                           <pic:cNvPicPr preferRelativeResize="0"/>
                         </pic:nvPicPr>
                         <pic:blipFill>
@@ -5710,12 +5710,12 @@
                 <wp:inline distB="19050" distT="19050" distL="19050" distR="19050">
                   <wp:extent cx="1333500" cy="1000125"/>
                   <wp:effectExtent b="0" l="0" r="0" t="0"/>
-                  <wp:docPr id="46" name="image55.jpg"/>
+                  <wp:docPr id="46" name="image36.jpg"/>
                   <a:graphic>
                     <a:graphicData uri="http://schemas.openxmlformats.org/drawingml/2006/picture">
                       <pic:pic>
                         <pic:nvPicPr>
-                          <pic:cNvPr id="0" name="image55.jpg"/>
+                          <pic:cNvPr id="0" name="image36.jpg"/>
                           <pic:cNvPicPr preferRelativeResize="0"/>
                         </pic:nvPicPr>
                         <pic:blipFill>
@@ -6072,12 +6072,12 @@
                 <wp:inline distB="19050" distT="19050" distL="19050" distR="19050">
                   <wp:extent cx="1333500" cy="1778000"/>
                   <wp:effectExtent b="0" l="0" r="0" t="0"/>
-                  <wp:docPr id="48" name="image46.jpg"/>
+                  <wp:docPr id="48" name="image39.jpg"/>
                   <a:graphic>
                     <a:graphicData uri="http://schemas.openxmlformats.org/drawingml/2006/picture">
                       <pic:pic>
                         <pic:nvPicPr>
-                          <pic:cNvPr id="0" name="image46.jpg"/>
+                          <pic:cNvPr id="0" name="image39.jpg"/>
                           <pic:cNvPicPr preferRelativeResize="0"/>
                         </pic:nvPicPr>
                         <pic:blipFill>
@@ -6362,12 +6362,12 @@
                 <wp:inline distB="19050" distT="19050" distL="19050" distR="19050">
                   <wp:extent cx="1333500" cy="1778000"/>
                   <wp:effectExtent b="0" l="0" r="0" t="0"/>
-                  <wp:docPr id="49" name="image44.jpg"/>
+                  <wp:docPr id="49" name="image35.jpg"/>
                   <a:graphic>
                     <a:graphicData uri="http://schemas.openxmlformats.org/drawingml/2006/picture">
                       <pic:pic>
                         <pic:nvPicPr>
-                          <pic:cNvPr id="0" name="image44.jpg"/>
+                          <pic:cNvPr id="0" name="image35.jpg"/>
                           <pic:cNvPicPr preferRelativeResize="0"/>
                         </pic:nvPicPr>
                         <pic:blipFill>
@@ -6670,12 +6670,12 @@
                 <wp:inline distB="19050" distT="19050" distL="19050" distR="19050">
                   <wp:extent cx="1333500" cy="1000125"/>
                   <wp:effectExtent b="0" l="0" r="0" t="0"/>
-                  <wp:docPr id="50" name="image36.jpg"/>
+                  <wp:docPr id="50" name="image52.jpg"/>
                   <a:graphic>
                     <a:graphicData uri="http://schemas.openxmlformats.org/drawingml/2006/picture">
                       <pic:pic>
                         <pic:nvPicPr>
-                          <pic:cNvPr id="0" name="image36.jpg"/>
+                          <pic:cNvPr id="0" name="image52.jpg"/>
                           <pic:cNvPicPr preferRelativeResize="0"/>
                         </pic:nvPicPr>
                         <pic:blipFill>
@@ -6965,12 +6965,12 @@
                 <wp:inline distB="19050" distT="19050" distL="19050" distR="19050">
                   <wp:extent cx="1333500" cy="1778000"/>
                   <wp:effectExtent b="0" l="0" r="0" t="0"/>
-                  <wp:docPr id="51" name="image52.jpg"/>
+                  <wp:docPr id="51" name="image42.jpg"/>
                   <a:graphic>
                     <a:graphicData uri="http://schemas.openxmlformats.org/drawingml/2006/picture">
                       <pic:pic>
                         <pic:nvPicPr>
-                          <pic:cNvPr id="0" name="image52.jpg"/>
+                          <pic:cNvPr id="0" name="image42.jpg"/>
                           <pic:cNvPicPr preferRelativeResize="0"/>
                         </pic:nvPicPr>
                         <pic:blipFill>
@@ -7258,12 +7258,12 @@
                 <wp:inline distB="19050" distT="19050" distL="19050" distR="19050">
                   <wp:extent cx="1333500" cy="1778000"/>
                   <wp:effectExtent b="0" l="0" r="0" t="0"/>
-                  <wp:docPr id="52" name="image51.jpg"/>
+                  <wp:docPr id="52" name="image56.jpg"/>
                   <a:graphic>
                     <a:graphicData uri="http://schemas.openxmlformats.org/drawingml/2006/picture">
                       <pic:pic>
                         <pic:nvPicPr>
-                          <pic:cNvPr id="0" name="image51.jpg"/>
+                          <pic:cNvPr id="0" name="image56.jpg"/>
                           <pic:cNvPicPr preferRelativeResize="0"/>
                         </pic:nvPicPr>
                         <pic:blipFill>
@@ -7551,12 +7551,12 @@
                 <wp:inline distB="19050" distT="19050" distL="19050" distR="19050">
                   <wp:extent cx="1333500" cy="1778000"/>
                   <wp:effectExtent b="0" l="0" r="0" t="0"/>
-                  <wp:docPr id="32" name="image39.jpg"/>
+                  <wp:docPr id="32" name="image37.jpg"/>
                   <a:graphic>
                     <a:graphicData uri="http://schemas.openxmlformats.org/drawingml/2006/picture">
                       <pic:pic>
                         <pic:nvPicPr>
-                          <pic:cNvPr id="0" name="image39.jpg"/>
+                          <pic:cNvPr id="0" name="image37.jpg"/>
                           <pic:cNvPicPr preferRelativeResize="0"/>
                         </pic:nvPicPr>
                         <pic:blipFill>
@@ -7822,12 +7822,12 @@
                 <wp:inline distB="19050" distT="19050" distL="19050" distR="19050">
                   <wp:extent cx="1333500" cy="1000125"/>
                   <wp:effectExtent b="0" l="0" r="0" t="0"/>
-                  <wp:docPr id="33" name="image34.jpg"/>
+                  <wp:docPr id="33" name="image40.jpg"/>
                   <a:graphic>
                     <a:graphicData uri="http://schemas.openxmlformats.org/drawingml/2006/picture">
                       <pic:pic>
                         <pic:nvPicPr>
-                          <pic:cNvPr id="0" name="image34.jpg"/>
+                          <pic:cNvPr id="0" name="image40.jpg"/>
                           <pic:cNvPicPr preferRelativeResize="0"/>
                         </pic:nvPicPr>
                         <pic:blipFill>
@@ -8396,12 +8396,12 @@
                 <wp:inline distB="19050" distT="19050" distL="19050" distR="19050">
                   <wp:extent cx="1333500" cy="1000125"/>
                   <wp:effectExtent b="0" l="0" r="0" t="0"/>
-                  <wp:docPr id="35" name="image41.jpg"/>
+                  <wp:docPr id="35" name="image34.jpg"/>
                   <a:graphic>
                     <a:graphicData uri="http://schemas.openxmlformats.org/drawingml/2006/picture">
                       <pic:pic>
                         <pic:nvPicPr>
-                          <pic:cNvPr id="0" name="image41.jpg"/>
+                          <pic:cNvPr id="0" name="image34.jpg"/>
                           <pic:cNvPicPr preferRelativeResize="0"/>
                         </pic:nvPicPr>
                         <pic:blipFill>
@@ -8437,12 +8437,12 @@
                 <wp:inline distB="19050" distT="19050" distL="19050" distR="19050">
                   <wp:extent cx="1333500" cy="1000125"/>
                   <wp:effectExtent b="0" l="0" r="0" t="0"/>
-                  <wp:docPr id="36" name="image37.jpg"/>
+                  <wp:docPr id="36" name="image46.jpg"/>
                   <a:graphic>
                     <a:graphicData uri="http://schemas.openxmlformats.org/drawingml/2006/picture">
                       <pic:pic>
                         <pic:nvPicPr>
-                          <pic:cNvPr id="0" name="image37.jpg"/>
+                          <pic:cNvPr id="0" name="image46.jpg"/>
                           <pic:cNvPicPr preferRelativeResize="0"/>
                         </pic:nvPicPr>
                         <pic:blipFill>
@@ -8730,12 +8730,12 @@
                 <wp:inline distB="19050" distT="19050" distL="19050" distR="19050">
                   <wp:extent cx="1333500" cy="1714010"/>
                   <wp:effectExtent b="0" l="0" r="0" t="0"/>
-                  <wp:docPr id="37" name="image53.jpg"/>
+                  <wp:docPr id="37" name="image51.jpg"/>
                   <a:graphic>
                     <a:graphicData uri="http://schemas.openxmlformats.org/drawingml/2006/picture">
                       <pic:pic>
                         <pic:nvPicPr>
-                          <pic:cNvPr id="0" name="image53.jpg"/>
+                          <pic:cNvPr id="0" name="image51.jpg"/>
                           <pic:cNvPicPr preferRelativeResize="0"/>
                         </pic:nvPicPr>
                         <pic:blipFill>
@@ -9023,12 +9023,12 @@
                 <wp:inline distB="19050" distT="19050" distL="19050" distR="19050">
                   <wp:extent cx="1333500" cy="1778000"/>
                   <wp:effectExtent b="0" l="0" r="0" t="0"/>
-                  <wp:docPr id="38" name="image42.jpg"/>
+                  <wp:docPr id="38" name="image47.jpg"/>
                   <a:graphic>
                     <a:graphicData uri="http://schemas.openxmlformats.org/drawingml/2006/picture">
                       <pic:pic>
                         <pic:nvPicPr>
-                          <pic:cNvPr id="0" name="image42.jpg"/>
+                          <pic:cNvPr id="0" name="image47.jpg"/>
                           <pic:cNvPicPr preferRelativeResize="0"/>
                         </pic:nvPicPr>
                         <pic:blipFill>
@@ -9440,12 +9440,12 @@
                 <wp:inline distB="19050" distT="19050" distL="19050" distR="19050">
                   <wp:extent cx="1333500" cy="2356007"/>
                   <wp:effectExtent b="0" l="0" r="0" t="0"/>
-                  <wp:docPr id="39" name="image49.jpg"/>
+                  <wp:docPr id="39" name="image33.jpg"/>
                   <a:graphic>
                     <a:graphicData uri="http://schemas.openxmlformats.org/drawingml/2006/picture">
                       <pic:pic>
                         <pic:nvPicPr>
-                          <pic:cNvPr id="0" name="image49.jpg"/>
+                          <pic:cNvPr id="0" name="image33.jpg"/>
                           <pic:cNvPicPr preferRelativeResize="0"/>
                         </pic:nvPicPr>
                         <pic:blipFill>
@@ -9770,12 +9770,12 @@
                 <wp:inline distB="19050" distT="19050" distL="19050" distR="19050">
                   <wp:extent cx="1333500" cy="1778000"/>
                   <wp:effectExtent b="0" l="0" r="0" t="0"/>
-                  <wp:docPr id="40" name="image58.jpg"/>
+                  <wp:docPr id="40" name="image38.jpg"/>
                   <a:graphic>
                     <a:graphicData uri="http://schemas.openxmlformats.org/drawingml/2006/picture">
                       <pic:pic>
                         <pic:nvPicPr>
-                          <pic:cNvPr id="0" name="image58.jpg"/>
+                          <pic:cNvPr id="0" name="image38.jpg"/>
                           <pic:cNvPicPr preferRelativeResize="0"/>
                         </pic:nvPicPr>
                         <pic:blipFill>
@@ -10187,12 +10187,12 @@
                 <wp:inline distB="19050" distT="19050" distL="19050" distR="19050">
                   <wp:extent cx="1333500" cy="1778000"/>
                   <wp:effectExtent b="0" l="0" r="0" t="0"/>
-                  <wp:docPr id="41" name="image40.jpg"/>
+                  <wp:docPr id="41" name="image41.jpg"/>
                   <a:graphic>
                     <a:graphicData uri="http://schemas.openxmlformats.org/drawingml/2006/picture">
                       <pic:pic>
                         <pic:nvPicPr>
-                          <pic:cNvPr id="0" name="image40.jpg"/>
+                          <pic:cNvPr id="0" name="image41.jpg"/>
                           <pic:cNvPicPr preferRelativeResize="0"/>
                         </pic:nvPicPr>
                         <pic:blipFill>
@@ -10421,7 +10421,99 @@
               <w:rPr>
                 <w:rtl w:val="0"/>
               </w:rPr>
-              <w:t xml:space="preserve">hiii juliaaa happy birthday!! You’re old just like me now!!!! Except you’ll always be cute punch to me. Love you so much Julia. U my sista from another mother, my business partner in crime, and my forever friend crush.</w:t>
+              <w:t xml:space="preserve">hiii juliaaa happy birthday!! You’re old just like me now!!!! Except you’ll always be cute punch to me. </w:t>
+            </w:r>
+          </w:p>
+          <w:p>
+            <w:pPr>
+              <w:pBdr>
+                <w:top w:space="0" w:sz="0" w:val="nil"/>
+                <w:left w:space="0" w:sz="0" w:val="nil"/>
+                <w:bottom w:space="0" w:sz="0" w:val="nil"/>
+                <w:right w:space="0" w:sz="0" w:val="nil"/>
+                <w:between w:space="0" w:sz="0" w:val="nil"/>
+              </w:pBdr>
+              <w:shd w:fill="auto" w:val="clear"/>
+              <w:rPr/>
+            </w:pPr>
+            <w:r>
+              <w:rPr>
+                <w:rtl w:val="0"/>
+              </w:rPr>
+            </w:r>
+          </w:p>
+          <w:p>
+            <w:pPr>
+              <w:pBdr>
+                <w:top w:space="0" w:sz="0" w:val="nil"/>
+                <w:left w:space="0" w:sz="0" w:val="nil"/>
+                <w:bottom w:space="0" w:sz="0" w:val="nil"/>
+                <w:right w:space="0" w:sz="0" w:val="nil"/>
+                <w:between w:space="0" w:sz="0" w:val="nil"/>
+              </w:pBdr>
+              <w:shd w:fill="auto" w:val="clear"/>
+              <w:rPr/>
+            </w:pPr>
+            <w:r>
+              <w:rPr>
+                <w:rtl w:val="0"/>
+              </w:rPr>
+              <w:t xml:space="preserve">This is one of the many favorite memories I have with you this year, when we influenced so hard, we ended up on our dream touch grass vacation. As you may remember this night, i had a moment where our roles reversed and suddenly I was the one scared in bed. You being you, I knew you would not scold me for forcing you downstairs to brave the murderer with me because you are nothing but kind, patient, loving, and all the other positive adjectives. Friendship with you is easy. </w:t>
+            </w:r>
+          </w:p>
+          <w:p>
+            <w:pPr>
+              <w:pBdr>
+                <w:top w:space="0" w:sz="0" w:val="nil"/>
+                <w:left w:space="0" w:sz="0" w:val="nil"/>
+                <w:bottom w:space="0" w:sz="0" w:val="nil"/>
+                <w:right w:space="0" w:sz="0" w:val="nil"/>
+                <w:between w:space="0" w:sz="0" w:val="nil"/>
+              </w:pBdr>
+              <w:shd w:fill="auto" w:val="clear"/>
+              <w:rPr/>
+            </w:pPr>
+            <w:r>
+              <w:rPr>
+                <w:rtl w:val="0"/>
+              </w:rPr>
+            </w:r>
+          </w:p>
+          <w:p>
+            <w:pPr>
+              <w:pBdr>
+                <w:top w:space="0" w:sz="0" w:val="nil"/>
+                <w:left w:space="0" w:sz="0" w:val="nil"/>
+                <w:bottom w:space="0" w:sz="0" w:val="nil"/>
+                <w:right w:space="0" w:sz="0" w:val="nil"/>
+                <w:between w:space="0" w:sz="0" w:val="nil"/>
+              </w:pBdr>
+              <w:shd w:fill="auto" w:val="clear"/>
+              <w:rPr/>
+            </w:pPr>
+            <w:r>
+              <w:rPr>
+                <w:rtl w:val="0"/>
+              </w:rPr>
+              <w:t xml:space="preserve">Love you so much Julia. U my sista from another mother, my business partner in crime, and my forever friend crush. </w:t>
+            </w:r>
+          </w:p>
+          <w:p>
+            <w:pPr>
+              <w:pBdr>
+                <w:top w:space="0" w:sz="0" w:val="nil"/>
+                <w:left w:space="0" w:sz="0" w:val="nil"/>
+                <w:bottom w:space="0" w:sz="0" w:val="nil"/>
+                <w:right w:space="0" w:sz="0" w:val="nil"/>
+                <w:between w:space="0" w:sz="0" w:val="nil"/>
+              </w:pBdr>
+              <w:shd w:fill="auto" w:val="clear"/>
+              <w:rPr/>
+            </w:pPr>
+            <w:r>
+              <w:rPr>
+                <w:rtl w:val="0"/>
+              </w:rPr>
             </w:r>
           </w:p>
           <w:p>
@@ -10485,12 +10577,12 @@
                 <wp:inline distB="19050" distT="19050" distL="19050" distR="19050">
                   <wp:extent cx="1333500" cy="2150806"/>
                   <wp:effectExtent b="0" l="0" r="0" t="0"/>
-                  <wp:docPr id="57" name="image50.jpg"/>
+                  <wp:docPr id="57" name="image58.jpg"/>
                   <a:graphic>
                     <a:graphicData uri="http://schemas.openxmlformats.org/drawingml/2006/picture">
                       <pic:pic>
                         <pic:nvPicPr>
-                          <pic:cNvPr id="0" name="image50.jpg"/>
+                          <pic:cNvPr id="0" name="image58.jpg"/>
                           <pic:cNvPicPr preferRelativeResize="0"/>
                         </pic:nvPicPr>
                         <pic:blipFill>
@@ -10801,12 +10893,12 @@
                 <wp:inline distB="114300" distT="114300" distL="114300" distR="114300">
                   <wp:extent cx="750094" cy="1000125"/>
                   <wp:effectExtent b="0" l="0" r="0" t="0"/>
-                  <wp:docPr id="53" name="image57.jpg"/>
+                  <wp:docPr id="53" name="image59.jpg"/>
                   <a:graphic>
                     <a:graphicData uri="http://schemas.openxmlformats.org/drawingml/2006/picture">
                       <pic:pic>
                         <pic:nvPicPr>
-                          <pic:cNvPr id="0" name="image57.jpg"/>
+                          <pic:cNvPr id="0" name="image59.jpg"/>
                           <pic:cNvPicPr preferRelativeResize="0"/>
                         </pic:nvPicPr>
                         <pic:blipFill>
@@ -11080,12 +11172,12 @@
                 <wp:inline distB="114300" distT="114300" distL="114300" distR="114300">
                   <wp:extent cx="750094" cy="1000125"/>
                   <wp:effectExtent b="0" l="0" r="0" t="0"/>
-                  <wp:docPr id="47" name="image54.jpg"/>
+                  <wp:docPr id="47" name="image57.jpg"/>
                   <a:graphic>
                     <a:graphicData uri="http://schemas.openxmlformats.org/drawingml/2006/picture">
                       <pic:pic>
                         <pic:nvPicPr>
-                          <pic:cNvPr id="0" name="image54.jpg"/>
+                          <pic:cNvPr id="0" name="image57.jpg"/>
                           <pic:cNvPicPr preferRelativeResize="0"/>
                         </pic:nvPicPr>
                         <pic:blipFill>
@@ -11359,12 +11451,12 @@
                 <wp:inline distB="114300" distT="114300" distL="114300" distR="114300">
                   <wp:extent cx="1333500" cy="1778179"/>
                   <wp:effectExtent b="0" l="0" r="0" t="0"/>
-                  <wp:docPr id="31" name="image32.jpg"/>
+                  <wp:docPr id="31" name="image45.jpg"/>
                   <a:graphic>
                     <a:graphicData uri="http://schemas.openxmlformats.org/drawingml/2006/picture">
                       <pic:pic>
                         <pic:nvPicPr>
-                          <pic:cNvPr id="0" name="image32.jpg"/>
+                          <pic:cNvPr id="0" name="image45.jpg"/>
                           <pic:cNvPicPr preferRelativeResize="0"/>
                         </pic:nvPicPr>
                         <pic:blipFill>
@@ -11675,12 +11767,12 @@
                 <wp:inline distB="114300" distT="114300" distL="114300" distR="114300">
                   <wp:extent cx="1333500" cy="1778179"/>
                   <wp:effectExtent b="0" l="0" r="0" t="0"/>
-                  <wp:docPr id="54" name="image47.jpg"/>
+                  <wp:docPr id="54" name="image49.jpg"/>
                   <a:graphic>
                     <a:graphicData uri="http://schemas.openxmlformats.org/drawingml/2006/picture">
                       <pic:pic>
                         <pic:nvPicPr>
-                          <pic:cNvPr id="0" name="image47.jpg"/>
+                          <pic:cNvPr id="0" name="image49.jpg"/>
                           <pic:cNvPicPr preferRelativeResize="0"/>
                         </pic:nvPicPr>
                         <pic:blipFill>
@@ -11716,12 +11808,12 @@
                 <wp:inline distB="114300" distT="114300" distL="114300" distR="114300">
                   <wp:extent cx="1333500" cy="1778000"/>
                   <wp:effectExtent b="0" l="0" r="0" t="0"/>
-                  <wp:docPr id="45" name="image31.jpg"/>
+                  <wp:docPr id="45" name="image50.jpg"/>
                   <a:graphic>
                     <a:graphicData uri="http://schemas.openxmlformats.org/drawingml/2006/picture">
                       <pic:pic>
                         <pic:nvPicPr>
-                          <pic:cNvPr id="0" name="image31.jpg"/>
+                          <pic:cNvPr id="0" name="image50.jpg"/>
                           <pic:cNvPicPr preferRelativeResize="0"/>
                         </pic:nvPicPr>
                         <pic:blipFill>
@@ -12014,12 +12106,12 @@
                 <wp:inline distB="114300" distT="114300" distL="114300" distR="114300">
                   <wp:extent cx="1333500" cy="1778000"/>
                   <wp:effectExtent b="0" l="0" r="0" t="0"/>
-                  <wp:docPr id="42" name="image33.jpg"/>
+                  <wp:docPr id="42" name="image32.jpg"/>
                   <a:graphic>
                     <a:graphicData uri="http://schemas.openxmlformats.org/drawingml/2006/picture">
                       <pic:pic>
                         <pic:nvPicPr>
-                          <pic:cNvPr id="0" name="image33.jpg"/>
+                          <pic:cNvPr id="0" name="image32.jpg"/>
                           <pic:cNvPicPr preferRelativeResize="0"/>
                         </pic:nvPicPr>
                         <pic:blipFill>
@@ -12293,12 +12385,12 @@
                 <wp:inline distB="114300" distT="114300" distL="114300" distR="114300">
                   <wp:extent cx="1333500" cy="1000695"/>
                   <wp:effectExtent b="0" l="0" r="0" t="0"/>
-                  <wp:docPr id="55" name="image45.jpg"/>
+                  <wp:docPr id="55" name="image53.jpg"/>
                   <a:graphic>
                     <a:graphicData uri="http://schemas.openxmlformats.org/drawingml/2006/picture">
                       <pic:pic>
                         <pic:nvPicPr>
-                          <pic:cNvPr id="0" name="image45.jpg"/>
+                          <pic:cNvPr id="0" name="image53.jpg"/>
                           <pic:cNvPicPr preferRelativeResize="0"/>
                         </pic:nvPicPr>
                         <pic:blipFill>
@@ -12757,12 +12849,12 @@
                 <wp:inline distB="114300" distT="114300" distL="114300" distR="114300">
                   <wp:extent cx="1333465" cy="2198116"/>
                   <wp:effectExtent b="0" l="0" r="0" t="0"/>
-                  <wp:docPr id="56" name="image48.jpg"/>
+                  <wp:docPr id="56" name="image54.jpg"/>
                   <a:graphic>
                     <a:graphicData uri="http://schemas.openxmlformats.org/drawingml/2006/picture">
                       <pic:pic>
                         <pic:nvPicPr>
-                          <pic:cNvPr id="0" name="image48.jpg"/>
+                          <pic:cNvPr id="0" name="image54.jpg"/>
                           <pic:cNvPicPr preferRelativeResize="0"/>
                         </pic:nvPicPr>
                         <pic:blipFill>

</xml_diff>